<commit_message>
Correct student, father and school for roll 11126020 (order 3667)
Co-Authored-By: Claude Opus 5.5 <noreply@anthropic.com>
</commit_message>
<xml_diff>
--- a/Admit_Cards_2026/DOCX/Admit_11126020.docx
+++ b/Admit_Cards_2026/DOCX/Admit_11126020.docx
@@ -138,7 +138,7 @@
                 <w:sz w:val="24"/>
                 <w:szCs w:val="24"/>
               </w:rPr>
-              <w:t xml:space="preserve">Nazmin Akter</w:t>
+              <w:t xml:space="preserve">Md.Naquibuddin</w:t>
             </w:r>
           </w:p>
         </w:tc>
@@ -192,7 +192,7 @@
                 <w:sz w:val="24"/>
                 <w:szCs w:val="24"/>
               </w:rPr>
-              <w:t xml:space="preserve">Nazmin Akter</w:t>
+              <w:t xml:space="preserve">Md.Jashim Uddin</w:t>
             </w:r>
           </w:p>
         </w:tc>
@@ -246,7 +246,7 @@
                 <w:sz w:val="24"/>
                 <w:szCs w:val="24"/>
               </w:rPr>
-              <w:t xml:space="preserve">Railway public High School</w:t>
+              <w:t xml:space="preserve">Railway Public High School</w:t>
             </w:r>
           </w:p>
         </w:tc>

</xml_diff>